<commit_message>
feat: agriflow screenshots, plain + illustrated report and slides (warm cream/green theme)
</commit_message>
<xml_diff>
--- a/AgriFlow_AI_Project_Report.docx
+++ b/AgriFlow_AI_Project_Report.docx
@@ -472,127 +472,6 @@
           <w:t>Right-click and choose "Update Field" to build this table.</w:t>
         </w:r>
         <w:fldChar w:fldCharType="end"/>
-      </w:r>
-    </w:p>
-    <w:p>
-      <w:r>
-        <w:br w:type="page"/>
-      </w:r>
-    </w:p>
-    <w:p>
-      <w:pPr>
-        <w:jc w:val="center"/>
-      </w:pPr>
-      <w:r>
-        <w:rPr>
-          <w:b/>
-          <w:sz w:val="28"/>
-        </w:rPr>
-        <w:t>LIST OF FIGURES</w:t>
-      </w:r>
-    </w:p>
-    <w:p>
-      <w:pPr>
-        <w:jc w:val="both"/>
-      </w:pPr>
-      <w:r>
-        <w:t>Figure 2.1: Comparison of Existing Systems by Capability</w:t>
-      </w:r>
-    </w:p>
-    <w:p>
-      <w:pPr>
-        <w:jc w:val="both"/>
-      </w:pPr>
-      <w:r>
-        <w:t>Figure 3.1: System Architecture of the AgriFlow AI Platform</w:t>
-      </w:r>
-    </w:p>
-    <w:p>
-      <w:pPr>
-        <w:jc w:val="both"/>
-      </w:pPr>
-      <w:r>
-        <w:t>Figure 3.2: Entity Relationship Diagram of the Database</w:t>
-      </w:r>
-    </w:p>
-    <w:p>
-      <w:pPr>
-        <w:jc w:val="both"/>
-      </w:pPr>
-      <w:r>
-        <w:t>Figure 3.3: Use-Case Diagram of the System</w:t>
-      </w:r>
-    </w:p>
-    <w:p>
-      <w:pPr>
-        <w:jc w:val="both"/>
-      </w:pPr>
-      <w:r>
-        <w:t>Figure 3.4: Delivery Scheduling Flowchart</w:t>
-      </w:r>
-    </w:p>
-    <w:p>
-      <w:pPr>
-        <w:jc w:val="both"/>
-      </w:pPr>
-      <w:r>
-        <w:t>Figure 4.1: Landing Page</w:t>
-      </w:r>
-    </w:p>
-    <w:p>
-      <w:pPr>
-        <w:jc w:val="both"/>
-      </w:pPr>
-      <w:r>
-        <w:t>Figure 4.2: Role-Based Signup and Login</w:t>
-      </w:r>
-    </w:p>
-    <w:p>
-      <w:pPr>
-        <w:jc w:val="both"/>
-      </w:pPr>
-      <w:r>
-        <w:t>Figure 4.3: Farmer Dashboard and Crop Management</w:t>
-      </w:r>
-    </w:p>
-    <w:p>
-      <w:pPr>
-        <w:jc w:val="both"/>
-      </w:pPr>
-      <w:r>
-        <w:t>Figure 4.4: Buyer Marketplace and Ordering</w:t>
-      </w:r>
-    </w:p>
-    <w:p>
-      <w:pPr>
-        <w:jc w:val="both"/>
-      </w:pPr>
-      <w:r>
-        <w:t>Figure 4.5: Warehouse Inventory with Shelf-Life Alerts</w:t>
-      </w:r>
-    </w:p>
-    <w:p>
-      <w:pPr>
-        <w:jc w:val="both"/>
-      </w:pPr>
-      <w:r>
-        <w:t>Figure 4.6: Transporter Delivery Workflow and Route Map</w:t>
-      </w:r>
-    </w:p>
-    <w:p>
-      <w:pPr>
-        <w:jc w:val="both"/>
-      </w:pPr>
-      <w:r>
-        <w:t>Figure 4.7: Admin Scheduling and Reports</w:t>
-      </w:r>
-    </w:p>
-    <w:p>
-      <w:pPr>
-        <w:jc w:val="both"/>
-      </w:pPr>
-      <w:r>
-        <w:t>Figure 4.8: AI Assistant Interface</w:t>
       </w:r>
     </w:p>
     <w:p>
@@ -2531,25 +2410,6 @@
     </w:p>
     <w:p>
       <w:pPr>
-        <w:jc w:val="both"/>
-      </w:pPr>
-      <w:r>
-        <w:t>Figure 2.1 provides a visual summary of how each platform maps to the six key capabilities.</w:t>
-      </w:r>
-    </w:p>
-    <w:p>
-      <w:pPr>
-        <w:jc w:val="center"/>
-      </w:pPr>
-      <w:r>
-        <w:rPr>
-          <w:i/>
-        </w:rPr>
-        <w:t>Figure 2.1: Comparison of Existing Systems by Capability</w:t>
-      </w:r>
-    </w:p>
-    <w:p>
-      <w:pPr>
         <w:pStyle w:val="Heading2"/>
       </w:pPr>
       <w:r>
@@ -3889,17 +3749,6 @@
     </w:p>
     <w:p>
       <w:pPr>
-        <w:jc w:val="center"/>
-      </w:pPr>
-      <w:r>
-        <w:rPr>
-          <w:i/>
-        </w:rPr>
-        <w:t>Figure 3.1: System Architecture of the AgriFlow AI Platform</w:t>
-      </w:r>
-    </w:p>
-    <w:p>
-      <w:pPr>
         <w:pStyle w:val="Heading2"/>
       </w:pPr>
       <w:r>
@@ -4268,28 +4117,6 @@
     </w:p>
     <w:p>
       <w:pPr>
-        <w:jc w:val="center"/>
-      </w:pPr>
-      <w:r>
-        <w:rPr>
-          <w:i/>
-        </w:rPr>
-        <w:t>Figure 3.2: Entity Relationship Diagram of the Database</w:t>
-      </w:r>
-    </w:p>
-    <w:p>
-      <w:pPr>
-        <w:jc w:val="center"/>
-      </w:pPr>
-      <w:r>
-        <w:rPr>
-          <w:i/>
-        </w:rPr>
-        <w:t>Figure 3.3: Use-Case Diagram of the System</w:t>
-      </w:r>
-    </w:p>
-    <w:p>
-      <w:pPr>
         <w:pStyle w:val="Heading2"/>
       </w:pPr>
       <w:r>
@@ -4325,59 +4152,7 @@
         <w:jc w:val="both"/>
       </w:pPr>
       <w:r>
-        <w:t>Figure 3.4 presents the scheduling flowchart, illustrating the complete flow from order placement to delivery completion, including the parallel processes of demand forecasting and shelf-life monitoring.</w:t>
-      </w:r>
-    </w:p>
-    <w:p>
-      <w:pPr>
-        <w:spacing w:before="120" w:after="60"/>
-        <w:jc w:val="center"/>
-      </w:pPr>
-      <w:r>
-        <w:drawing>
-          <wp:inline xmlns:a="http://schemas.openxmlformats.org/drawingml/2006/main" xmlns:pic="http://schemas.openxmlformats.org/drawingml/2006/picture">
-            <wp:extent cx="5040000" cy="7231304"/>
-            <wp:docPr id="1" name="Picture 1"/>
-            <wp:cNvGraphicFramePr>
-              <a:graphicFrameLocks noChangeAspect="1"/>
-            </wp:cNvGraphicFramePr>
-            <a:graphic>
-              <a:graphicData uri="http://schemas.openxmlformats.org/drawingml/2006/picture">
-                <pic:pic>
-                  <pic:nvPicPr>
-                    <pic:cNvPr id="0" name="scheduler_flowchart.png"/>
-                    <pic:cNvPicPr/>
-                  </pic:nvPicPr>
-                  <pic:blipFill>
-                    <a:blip r:embed="rId12"/>
-                    <a:stretch>
-                      <a:fillRect/>
-                    </a:stretch>
-                  </pic:blipFill>
-                  <pic:spPr>
-                    <a:xfrm>
-                      <a:off x="0" y="0"/>
-                      <a:ext cx="5040000" cy="7231304"/>
-                    </a:xfrm>
-                    <a:prstGeom prst="rect"/>
-                  </pic:spPr>
-                </pic:pic>
-              </a:graphicData>
-            </a:graphic>
-          </wp:inline>
-        </w:drawing>
-      </w:r>
-    </w:p>
-    <w:p>
-      <w:pPr>
-        <w:spacing w:before="60" w:after="240"/>
-        <w:jc w:val="center"/>
-      </w:pPr>
-      <w:r>
-        <w:rPr>
-          <w:i/>
-        </w:rPr>
-        <w:t>Figure 3.4: Delivery Scheduling Flowchart of the AgriFlow AI Platform</w:t>
+        <w:t>The scheduling flowchart illustrates the complete flow from order placement to delivery completion, including the parallel processes of demand forecasting and shelf-life monitoring.</w:t>
       </w:r>
     </w:p>
     <w:p>
@@ -5164,59 +4939,7 @@
         <w:jc w:val="both"/>
       </w:pPr>
       <w:r>
-        <w:t>The landing page, shown in Figure 4.1, presents the platform with a hero section, feature highlights, and informational sections that introduce new users to the system.</w:t>
-      </w:r>
-    </w:p>
-    <w:p>
-      <w:pPr>
-        <w:spacing w:before="120" w:after="60"/>
-        <w:jc w:val="center"/>
-      </w:pPr>
-      <w:r>
-        <w:drawing>
-          <wp:inline xmlns:a="http://schemas.openxmlformats.org/drawingml/2006/main" xmlns:pic="http://schemas.openxmlformats.org/drawingml/2006/picture">
-            <wp:extent cx="5040000" cy="20927812"/>
-            <wp:docPr id="2" name="Picture 2"/>
-            <wp:cNvGraphicFramePr>
-              <a:graphicFrameLocks noChangeAspect="1"/>
-            </wp:cNvGraphicFramePr>
-            <a:graphic>
-              <a:graphicData uri="http://schemas.openxmlformats.org/drawingml/2006/picture">
-                <pic:pic>
-                  <pic:nvPicPr>
-                    <pic:cNvPr id="0" name="01-landing.png"/>
-                    <pic:cNvPicPr/>
-                  </pic:nvPicPr>
-                  <pic:blipFill>
-                    <a:blip r:embed="rId13"/>
-                    <a:stretch>
-                      <a:fillRect/>
-                    </a:stretch>
-                  </pic:blipFill>
-                  <pic:spPr>
-                    <a:xfrm>
-                      <a:off x="0" y="0"/>
-                      <a:ext cx="5040000" cy="20927812"/>
-                    </a:xfrm>
-                    <a:prstGeom prst="rect"/>
-                  </pic:spPr>
-                </pic:pic>
-              </a:graphicData>
-            </a:graphic>
-          </wp:inline>
-        </w:drawing>
-      </w:r>
-    </w:p>
-    <w:p>
-      <w:pPr>
-        <w:spacing w:before="60" w:after="240"/>
-        <w:jc w:val="center"/>
-      </w:pPr>
-      <w:r>
-        <w:rPr>
-          <w:i/>
-        </w:rPr>
-        <w:t>Figure 4.1: Landing Page of the AgriFlow AI Platform</w:t>
+        <w:t>The landing page presents the platform with a hero section, feature highlights, and informational sections that introduce new users to the system.</w:t>
       </w:r>
     </w:p>
     <w:p>
@@ -5232,59 +4955,7 @@
         <w:jc w:val="both"/>
       </w:pPr>
       <w:r>
-        <w:t>The signup and login interfaces, shown in Figure 4.2, allow users to register under one of the five roles and to authenticate, with features such as a password strength meter and secure password generator.</w:t>
-      </w:r>
-    </w:p>
-    <w:p>
-      <w:pPr>
-        <w:spacing w:before="120" w:after="60"/>
-        <w:jc w:val="center"/>
-      </w:pPr>
-      <w:r>
-        <w:drawing>
-          <wp:inline xmlns:a="http://schemas.openxmlformats.org/drawingml/2006/main" xmlns:pic="http://schemas.openxmlformats.org/drawingml/2006/picture">
-            <wp:extent cx="5040000" cy="3150000"/>
-            <wp:docPr id="3" name="Picture 3"/>
-            <wp:cNvGraphicFramePr>
-              <a:graphicFrameLocks noChangeAspect="1"/>
-            </wp:cNvGraphicFramePr>
-            <a:graphic>
-              <a:graphicData uri="http://schemas.openxmlformats.org/drawingml/2006/picture">
-                <pic:pic>
-                  <pic:nvPicPr>
-                    <pic:cNvPr id="0" name="03-signup.png"/>
-                    <pic:cNvPicPr/>
-                  </pic:nvPicPr>
-                  <pic:blipFill>
-                    <a:blip r:embed="rId14"/>
-                    <a:stretch>
-                      <a:fillRect/>
-                    </a:stretch>
-                  </pic:blipFill>
-                  <pic:spPr>
-                    <a:xfrm>
-                      <a:off x="0" y="0"/>
-                      <a:ext cx="5040000" cy="3150000"/>
-                    </a:xfrm>
-                    <a:prstGeom prst="rect"/>
-                  </pic:spPr>
-                </pic:pic>
-              </a:graphicData>
-            </a:graphic>
-          </wp:inline>
-        </w:drawing>
-      </w:r>
-    </w:p>
-    <w:p>
-      <w:pPr>
-        <w:spacing w:before="60" w:after="240"/>
-        <w:jc w:val="center"/>
-      </w:pPr>
-      <w:r>
-        <w:rPr>
-          <w:i/>
-        </w:rPr>
-        <w:t>Figure 4.2: Signup Interface (left) and Login Interface (right)</w:t>
+        <w:t>The signup and login interfaces allow users to register under one of the five roles and to authenticate, with features such as a password strength meter and secure password generator.</w:t>
       </w:r>
     </w:p>
     <w:p>
@@ -5300,59 +4971,7 @@
         <w:jc w:val="both"/>
       </w:pPr>
       <w:r>
-        <w:t>The farmer dashboard and crop management interfaces, shown in Figure 4.3, allow farmers to manage crops, record harvests with pricing and grading, view a harvest calendar, and confirm incoming orders.</w:t>
-      </w:r>
-    </w:p>
-    <w:p>
-      <w:pPr>
-        <w:spacing w:before="120" w:after="60"/>
-        <w:jc w:val="center"/>
-      </w:pPr>
-      <w:r>
-        <w:drawing>
-          <wp:inline xmlns:a="http://schemas.openxmlformats.org/drawingml/2006/main" xmlns:pic="http://schemas.openxmlformats.org/drawingml/2006/picture">
-            <wp:extent cx="5040000" cy="3150000"/>
-            <wp:docPr id="4" name="Picture 4"/>
-            <wp:cNvGraphicFramePr>
-              <a:graphicFrameLocks noChangeAspect="1"/>
-            </wp:cNvGraphicFramePr>
-            <a:graphic>
-              <a:graphicData uri="http://schemas.openxmlformats.org/drawingml/2006/picture">
-                <pic:pic>
-                  <pic:nvPicPr>
-                    <pic:cNvPr id="0" name="dash-farmer.png"/>
-                    <pic:cNvPicPr/>
-                  </pic:nvPicPr>
-                  <pic:blipFill>
-                    <a:blip r:embed="rId15"/>
-                    <a:stretch>
-                      <a:fillRect/>
-                    </a:stretch>
-                  </pic:blipFill>
-                  <pic:spPr>
-                    <a:xfrm>
-                      <a:off x="0" y="0"/>
-                      <a:ext cx="5040000" cy="3150000"/>
-                    </a:xfrm>
-                    <a:prstGeom prst="rect"/>
-                  </pic:spPr>
-                </pic:pic>
-              </a:graphicData>
-            </a:graphic>
-          </wp:inline>
-        </w:drawing>
-      </w:r>
-    </w:p>
-    <w:p>
-      <w:pPr>
-        <w:spacing w:before="60" w:after="240"/>
-        <w:jc w:val="center"/>
-      </w:pPr>
-      <w:r>
-        <w:rPr>
-          <w:i/>
-        </w:rPr>
-        <w:t>Figure 4.3: Farmer Dashboard of the AgriFlow AI Platform</w:t>
+        <w:t>The farmer dashboard and crop management interfaces allow farmers to manage crops, record harvests with pricing and grading, view a harvest calendar, and confirm incoming orders.</w:t>
       </w:r>
     </w:p>
     <w:p>
@@ -5368,59 +4987,7 @@
         <w:jc w:val="both"/>
       </w:pPr>
       <w:r>
-        <w:t>The buyer marketplace and ordering interfaces, shown in Figure 4.4, allow buyers to search available produce, place orders with a delivery location, and track their orders.</w:t>
-      </w:r>
-    </w:p>
-    <w:p>
-      <w:pPr>
-        <w:spacing w:before="120" w:after="60"/>
-        <w:jc w:val="center"/>
-      </w:pPr>
-      <w:r>
-        <w:drawing>
-          <wp:inline xmlns:a="http://schemas.openxmlformats.org/drawingml/2006/main" xmlns:pic="http://schemas.openxmlformats.org/drawingml/2006/picture">
-            <wp:extent cx="5040000" cy="3150000"/>
-            <wp:docPr id="5" name="Picture 5"/>
-            <wp:cNvGraphicFramePr>
-              <a:graphicFrameLocks noChangeAspect="1"/>
-            </wp:cNvGraphicFramePr>
-            <a:graphic>
-              <a:graphicData uri="http://schemas.openxmlformats.org/drawingml/2006/picture">
-                <pic:pic>
-                  <pic:nvPicPr>
-                    <pic:cNvPr id="0" name="dash-buyer.png"/>
-                    <pic:cNvPicPr/>
-                  </pic:nvPicPr>
-                  <pic:blipFill>
-                    <a:blip r:embed="rId16"/>
-                    <a:stretch>
-                      <a:fillRect/>
-                    </a:stretch>
-                  </pic:blipFill>
-                  <pic:spPr>
-                    <a:xfrm>
-                      <a:off x="0" y="0"/>
-                      <a:ext cx="5040000" cy="3150000"/>
-                    </a:xfrm>
-                    <a:prstGeom prst="rect"/>
-                  </pic:spPr>
-                </pic:pic>
-              </a:graphicData>
-            </a:graphic>
-          </wp:inline>
-        </w:drawing>
-      </w:r>
-    </w:p>
-    <w:p>
-      <w:pPr>
-        <w:spacing w:before="60" w:after="240"/>
-        <w:jc w:val="center"/>
-      </w:pPr>
-      <w:r>
-        <w:rPr>
-          <w:i/>
-        </w:rPr>
-        <w:t>Figure 4.4: Buyer Marketplace of the AgriFlow AI Platform</w:t>
+        <w:t>The buyer marketplace and ordering interfaces allow buyers to search available produce, place orders with a delivery location, and track their orders.</w:t>
       </w:r>
     </w:p>
     <w:p>
@@ -5436,59 +5003,7 @@
         <w:jc w:val="both"/>
       </w:pPr>
       <w:r>
-        <w:t>The warehouse inventory interface, shown in Figure 4.5, displays stored items with live shelf-life status, supports stock-in and stock-out operations, and records stock movements.</w:t>
-      </w:r>
-    </w:p>
-    <w:p>
-      <w:pPr>
-        <w:spacing w:before="120" w:after="60"/>
-        <w:jc w:val="center"/>
-      </w:pPr>
-      <w:r>
-        <w:drawing>
-          <wp:inline xmlns:a="http://schemas.openxmlformats.org/drawingml/2006/main" xmlns:pic="http://schemas.openxmlformats.org/drawingml/2006/picture">
-            <wp:extent cx="5040000" cy="3150000"/>
-            <wp:docPr id="6" name="Picture 6"/>
-            <wp:cNvGraphicFramePr>
-              <a:graphicFrameLocks noChangeAspect="1"/>
-            </wp:cNvGraphicFramePr>
-            <a:graphic>
-              <a:graphicData uri="http://schemas.openxmlformats.org/drawingml/2006/picture">
-                <pic:pic>
-                  <pic:nvPicPr>
-                    <pic:cNvPr id="0" name="warehouse-inventory.png"/>
-                    <pic:cNvPicPr/>
-                  </pic:nvPicPr>
-                  <pic:blipFill>
-                    <a:blip r:embed="rId17"/>
-                    <a:stretch>
-                      <a:fillRect/>
-                    </a:stretch>
-                  </pic:blipFill>
-                  <pic:spPr>
-                    <a:xfrm>
-                      <a:off x="0" y="0"/>
-                      <a:ext cx="5040000" cy="3150000"/>
-                    </a:xfrm>
-                    <a:prstGeom prst="rect"/>
-                  </pic:spPr>
-                </pic:pic>
-              </a:graphicData>
-            </a:graphic>
-          </wp:inline>
-        </w:drawing>
-      </w:r>
-    </w:p>
-    <w:p>
-      <w:pPr>
-        <w:spacing w:before="60" w:after="240"/>
-        <w:jc w:val="center"/>
-      </w:pPr>
-      <w:r>
-        <w:rPr>
-          <w:i/>
-        </w:rPr>
-        <w:t>Figure 4.5: Warehouse Inventory Interface of the AgriFlow AI Platform</w:t>
+        <w:t>The warehouse inventory interface displays stored items with live shelf-life status, supports stock-in and stock-out operations, and records stock movements.</w:t>
       </w:r>
     </w:p>
     <w:p>
@@ -5504,59 +5019,7 @@
         <w:jc w:val="both"/>
       </w:pPr>
       <w:r>
-        <w:t>The transporter interfaces, shown in Figure 4.6, present assigned deliveries and allow the transporter to advance each delivery through its workflow, with routes displayed on a Leaflet map.</w:t>
-      </w:r>
-    </w:p>
-    <w:p>
-      <w:pPr>
-        <w:spacing w:before="120" w:after="60"/>
-        <w:jc w:val="center"/>
-      </w:pPr>
-      <w:r>
-        <w:drawing>
-          <wp:inline xmlns:a="http://schemas.openxmlformats.org/drawingml/2006/main" xmlns:pic="http://schemas.openxmlformats.org/drawingml/2006/picture">
-            <wp:extent cx="5040000" cy="3150000"/>
-            <wp:docPr id="7" name="Picture 7"/>
-            <wp:cNvGraphicFramePr>
-              <a:graphicFrameLocks noChangeAspect="1"/>
-            </wp:cNvGraphicFramePr>
-            <a:graphic>
-              <a:graphicData uri="http://schemas.openxmlformats.org/drawingml/2006/picture">
-                <pic:pic>
-                  <pic:nvPicPr>
-                    <pic:cNvPr id="0" name="dash-transporter.png"/>
-                    <pic:cNvPicPr/>
-                  </pic:nvPicPr>
-                  <pic:blipFill>
-                    <a:blip r:embed="rId18"/>
-                    <a:stretch>
-                      <a:fillRect/>
-                    </a:stretch>
-                  </pic:blipFill>
-                  <pic:spPr>
-                    <a:xfrm>
-                      <a:off x="0" y="0"/>
-                      <a:ext cx="5040000" cy="3150000"/>
-                    </a:xfrm>
-                    <a:prstGeom prst="rect"/>
-                  </pic:spPr>
-                </pic:pic>
-              </a:graphicData>
-            </a:graphic>
-          </wp:inline>
-        </w:drawing>
-      </w:r>
-    </w:p>
-    <w:p>
-      <w:pPr>
-        <w:spacing w:before="60" w:after="240"/>
-        <w:jc w:val="center"/>
-      </w:pPr>
-      <w:r>
-        <w:rPr>
-          <w:i/>
-        </w:rPr>
-        <w:t>Figure 4.6: Transporter Delivery Workflow of the AgriFlow AI Platform</w:t>
+        <w:t>The transporter interfaces present assigned deliveries and allow the transporter to advance each delivery through its workflow, with routes displayed on a Leaflet map.</w:t>
       </w:r>
     </w:p>
     <w:p>
@@ -5572,59 +5035,7 @@
         <w:jc w:val="both"/>
       </w:pPr>
       <w:r>
-        <w:t>The administrator interfaces, shown in Figure 4.7, provide user management with role changes, a full order log, platform statistics, analytics reports, and a control to run the scheduling engine.</w:t>
-      </w:r>
-    </w:p>
-    <w:p>
-      <w:pPr>
-        <w:spacing w:before="120" w:after="60"/>
-        <w:jc w:val="center"/>
-      </w:pPr>
-      <w:r>
-        <w:drawing>
-          <wp:inline xmlns:a="http://schemas.openxmlformats.org/drawingml/2006/main" xmlns:pic="http://schemas.openxmlformats.org/drawingml/2006/picture">
-            <wp:extent cx="5040000" cy="3150000"/>
-            <wp:docPr id="8" name="Picture 8"/>
-            <wp:cNvGraphicFramePr>
-              <a:graphicFrameLocks noChangeAspect="1"/>
-            </wp:cNvGraphicFramePr>
-            <a:graphic>
-              <a:graphicData uri="http://schemas.openxmlformats.org/drawingml/2006/picture">
-                <pic:pic>
-                  <pic:nvPicPr>
-                    <pic:cNvPr id="0" name="dash-admin.png"/>
-                    <pic:cNvPicPr/>
-                  </pic:nvPicPr>
-                  <pic:blipFill>
-                    <a:blip r:embed="rId19"/>
-                    <a:stretch>
-                      <a:fillRect/>
-                    </a:stretch>
-                  </pic:blipFill>
-                  <pic:spPr>
-                    <a:xfrm>
-                      <a:off x="0" y="0"/>
-                      <a:ext cx="5040000" cy="3150000"/>
-                    </a:xfrm>
-                    <a:prstGeom prst="rect"/>
-                  </pic:spPr>
-                </pic:pic>
-              </a:graphicData>
-            </a:graphic>
-          </wp:inline>
-        </w:drawing>
-      </w:r>
-    </w:p>
-    <w:p>
-      <w:pPr>
-        <w:spacing w:before="60" w:after="240"/>
-        <w:jc w:val="center"/>
-      </w:pPr>
-      <w:r>
-        <w:rPr>
-          <w:i/>
-        </w:rPr>
-        <w:t>Figure 4.7: Administrator Scheduling Interface of the AgriFlow AI Platform</w:t>
+        <w:t>The administrator interfaces provide user management with role changes, a full order log, platform statistics, analytics reports, and a control to run the scheduling engine.</w:t>
       </w:r>
     </w:p>
     <w:p>
@@ -5640,59 +5051,7 @@
         <w:jc w:val="both"/>
       </w:pPr>
       <w:r>
-        <w:t>The assistant interface, shown in Figure 4.8, allows users to ask questions about their data and receive plain-language explanations grounded in their live profile, orders, inventory, and forecasts.</w:t>
-      </w:r>
-    </w:p>
-    <w:p>
-      <w:pPr>
-        <w:spacing w:before="120" w:after="60"/>
-        <w:jc w:val="center"/>
-      </w:pPr>
-      <w:r>
-        <w:drawing>
-          <wp:inline xmlns:a="http://schemas.openxmlformats.org/drawingml/2006/main" xmlns:pic="http://schemas.openxmlformats.org/drawingml/2006/picture">
-            <wp:extent cx="5040000" cy="3150000"/>
-            <wp:docPr id="9" name="Picture 9"/>
-            <wp:cNvGraphicFramePr>
-              <a:graphicFrameLocks noChangeAspect="1"/>
-            </wp:cNvGraphicFramePr>
-            <a:graphic>
-              <a:graphicData uri="http://schemas.openxmlformats.org/drawingml/2006/picture">
-                <pic:pic>
-                  <pic:nvPicPr>
-                    <pic:cNvPr id="0" name="assistant.png"/>
-                    <pic:cNvPicPr/>
-                  </pic:nvPicPr>
-                  <pic:blipFill>
-                    <a:blip r:embed="rId20"/>
-                    <a:stretch>
-                      <a:fillRect/>
-                    </a:stretch>
-                  </pic:blipFill>
-                  <pic:spPr>
-                    <a:xfrm>
-                      <a:off x="0" y="0"/>
-                      <a:ext cx="5040000" cy="3150000"/>
-                    </a:xfrm>
-                    <a:prstGeom prst="rect"/>
-                  </pic:spPr>
-                </pic:pic>
-              </a:graphicData>
-            </a:graphic>
-          </wp:inline>
-        </w:drawing>
-      </w:r>
-    </w:p>
-    <w:p>
-      <w:pPr>
-        <w:spacing w:before="60" w:after="240"/>
-        <w:jc w:val="center"/>
-      </w:pPr>
-      <w:r>
-        <w:rPr>
-          <w:i/>
-        </w:rPr>
-        <w:t>Figure 4.8: AI Assistant Interface of the AgriFlow AI Platform</w:t>
+        <w:t>The assistant interface allows users to ask questions about their data and receive plain-language explanations grounded in their live profile, orders, inventory, and forecasts.</w:t>
       </w:r>
     </w:p>
     <w:p>

</xml_diff>

<commit_message>
Revert "feat: agriflow screenshots, plain + illustrated report and slides (warm cream/green theme)"
This reverts commit b0fa636db4dd0aa6fc2c715cab9d3381859b68fb.
</commit_message>
<xml_diff>
--- a/AgriFlow_AI_Project_Report.docx
+++ b/AgriFlow_AI_Project_Report.docx
@@ -472,6 +472,127 @@
           <w:t>Right-click and choose "Update Field" to build this table.</w:t>
         </w:r>
         <w:fldChar w:fldCharType="end"/>
+      </w:r>
+    </w:p>
+    <w:p>
+      <w:r>
+        <w:br w:type="page"/>
+      </w:r>
+    </w:p>
+    <w:p>
+      <w:pPr>
+        <w:jc w:val="center"/>
+      </w:pPr>
+      <w:r>
+        <w:rPr>
+          <w:b/>
+          <w:sz w:val="28"/>
+        </w:rPr>
+        <w:t>LIST OF FIGURES</w:t>
+      </w:r>
+    </w:p>
+    <w:p>
+      <w:pPr>
+        <w:jc w:val="both"/>
+      </w:pPr>
+      <w:r>
+        <w:t>Figure 2.1: Comparison of Existing Systems by Capability</w:t>
+      </w:r>
+    </w:p>
+    <w:p>
+      <w:pPr>
+        <w:jc w:val="both"/>
+      </w:pPr>
+      <w:r>
+        <w:t>Figure 3.1: System Architecture of the AgriFlow AI Platform</w:t>
+      </w:r>
+    </w:p>
+    <w:p>
+      <w:pPr>
+        <w:jc w:val="both"/>
+      </w:pPr>
+      <w:r>
+        <w:t>Figure 3.2: Entity Relationship Diagram of the Database</w:t>
+      </w:r>
+    </w:p>
+    <w:p>
+      <w:pPr>
+        <w:jc w:val="both"/>
+      </w:pPr>
+      <w:r>
+        <w:t>Figure 3.3: Use-Case Diagram of the System</w:t>
+      </w:r>
+    </w:p>
+    <w:p>
+      <w:pPr>
+        <w:jc w:val="both"/>
+      </w:pPr>
+      <w:r>
+        <w:t>Figure 3.4: Delivery Scheduling Flowchart</w:t>
+      </w:r>
+    </w:p>
+    <w:p>
+      <w:pPr>
+        <w:jc w:val="both"/>
+      </w:pPr>
+      <w:r>
+        <w:t>Figure 4.1: Landing Page</w:t>
+      </w:r>
+    </w:p>
+    <w:p>
+      <w:pPr>
+        <w:jc w:val="both"/>
+      </w:pPr>
+      <w:r>
+        <w:t>Figure 4.2: Role-Based Signup and Login</w:t>
+      </w:r>
+    </w:p>
+    <w:p>
+      <w:pPr>
+        <w:jc w:val="both"/>
+      </w:pPr>
+      <w:r>
+        <w:t>Figure 4.3: Farmer Dashboard and Crop Management</w:t>
+      </w:r>
+    </w:p>
+    <w:p>
+      <w:pPr>
+        <w:jc w:val="both"/>
+      </w:pPr>
+      <w:r>
+        <w:t>Figure 4.4: Buyer Marketplace and Ordering</w:t>
+      </w:r>
+    </w:p>
+    <w:p>
+      <w:pPr>
+        <w:jc w:val="both"/>
+      </w:pPr>
+      <w:r>
+        <w:t>Figure 4.5: Warehouse Inventory with Shelf-Life Alerts</w:t>
+      </w:r>
+    </w:p>
+    <w:p>
+      <w:pPr>
+        <w:jc w:val="both"/>
+      </w:pPr>
+      <w:r>
+        <w:t>Figure 4.6: Transporter Delivery Workflow and Route Map</w:t>
+      </w:r>
+    </w:p>
+    <w:p>
+      <w:pPr>
+        <w:jc w:val="both"/>
+      </w:pPr>
+      <w:r>
+        <w:t>Figure 4.7: Admin Scheduling and Reports</w:t>
+      </w:r>
+    </w:p>
+    <w:p>
+      <w:pPr>
+        <w:jc w:val="both"/>
+      </w:pPr>
+      <w:r>
+        <w:t>Figure 4.8: AI Assistant Interface</w:t>
       </w:r>
     </w:p>
     <w:p>
@@ -2410,6 +2531,25 @@
     </w:p>
     <w:p>
       <w:pPr>
+        <w:jc w:val="both"/>
+      </w:pPr>
+      <w:r>
+        <w:t>Figure 2.1 provides a visual summary of how each platform maps to the six key capabilities.</w:t>
+      </w:r>
+    </w:p>
+    <w:p>
+      <w:pPr>
+        <w:jc w:val="center"/>
+      </w:pPr>
+      <w:r>
+        <w:rPr>
+          <w:i/>
+        </w:rPr>
+        <w:t>Figure 2.1: Comparison of Existing Systems by Capability</w:t>
+      </w:r>
+    </w:p>
+    <w:p>
+      <w:pPr>
         <w:pStyle w:val="Heading2"/>
       </w:pPr>
       <w:r>
@@ -3749,6 +3889,17 @@
     </w:p>
     <w:p>
       <w:pPr>
+        <w:jc w:val="center"/>
+      </w:pPr>
+      <w:r>
+        <w:rPr>
+          <w:i/>
+        </w:rPr>
+        <w:t>Figure 3.1: System Architecture of the AgriFlow AI Platform</w:t>
+      </w:r>
+    </w:p>
+    <w:p>
+      <w:pPr>
         <w:pStyle w:val="Heading2"/>
       </w:pPr>
       <w:r>
@@ -4117,6 +4268,28 @@
     </w:p>
     <w:p>
       <w:pPr>
+        <w:jc w:val="center"/>
+      </w:pPr>
+      <w:r>
+        <w:rPr>
+          <w:i/>
+        </w:rPr>
+        <w:t>Figure 3.2: Entity Relationship Diagram of the Database</w:t>
+      </w:r>
+    </w:p>
+    <w:p>
+      <w:pPr>
+        <w:jc w:val="center"/>
+      </w:pPr>
+      <w:r>
+        <w:rPr>
+          <w:i/>
+        </w:rPr>
+        <w:t>Figure 3.3: Use-Case Diagram of the System</w:t>
+      </w:r>
+    </w:p>
+    <w:p>
+      <w:pPr>
         <w:pStyle w:val="Heading2"/>
       </w:pPr>
       <w:r>
@@ -4152,7 +4325,59 @@
         <w:jc w:val="both"/>
       </w:pPr>
       <w:r>
-        <w:t>The scheduling flowchart illustrates the complete flow from order placement to delivery completion, including the parallel processes of demand forecasting and shelf-life monitoring.</w:t>
+        <w:t>Figure 3.4 presents the scheduling flowchart, illustrating the complete flow from order placement to delivery completion, including the parallel processes of demand forecasting and shelf-life monitoring.</w:t>
+      </w:r>
+    </w:p>
+    <w:p>
+      <w:pPr>
+        <w:spacing w:before="120" w:after="60"/>
+        <w:jc w:val="center"/>
+      </w:pPr>
+      <w:r>
+        <w:drawing>
+          <wp:inline xmlns:a="http://schemas.openxmlformats.org/drawingml/2006/main" xmlns:pic="http://schemas.openxmlformats.org/drawingml/2006/picture">
+            <wp:extent cx="5040000" cy="7231304"/>
+            <wp:docPr id="1" name="Picture 1"/>
+            <wp:cNvGraphicFramePr>
+              <a:graphicFrameLocks noChangeAspect="1"/>
+            </wp:cNvGraphicFramePr>
+            <a:graphic>
+              <a:graphicData uri="http://schemas.openxmlformats.org/drawingml/2006/picture">
+                <pic:pic>
+                  <pic:nvPicPr>
+                    <pic:cNvPr id="0" name="scheduler_flowchart.png"/>
+                    <pic:cNvPicPr/>
+                  </pic:nvPicPr>
+                  <pic:blipFill>
+                    <a:blip r:embed="rId12"/>
+                    <a:stretch>
+                      <a:fillRect/>
+                    </a:stretch>
+                  </pic:blipFill>
+                  <pic:spPr>
+                    <a:xfrm>
+                      <a:off x="0" y="0"/>
+                      <a:ext cx="5040000" cy="7231304"/>
+                    </a:xfrm>
+                    <a:prstGeom prst="rect"/>
+                  </pic:spPr>
+                </pic:pic>
+              </a:graphicData>
+            </a:graphic>
+          </wp:inline>
+        </w:drawing>
+      </w:r>
+    </w:p>
+    <w:p>
+      <w:pPr>
+        <w:spacing w:before="60" w:after="240"/>
+        <w:jc w:val="center"/>
+      </w:pPr>
+      <w:r>
+        <w:rPr>
+          <w:i/>
+        </w:rPr>
+        <w:t>Figure 3.4: Delivery Scheduling Flowchart of the AgriFlow AI Platform</w:t>
       </w:r>
     </w:p>
     <w:p>
@@ -4939,7 +5164,59 @@
         <w:jc w:val="both"/>
       </w:pPr>
       <w:r>
-        <w:t>The landing page presents the platform with a hero section, feature highlights, and informational sections that introduce new users to the system.</w:t>
+        <w:t>The landing page, shown in Figure 4.1, presents the platform with a hero section, feature highlights, and informational sections that introduce new users to the system.</w:t>
+      </w:r>
+    </w:p>
+    <w:p>
+      <w:pPr>
+        <w:spacing w:before="120" w:after="60"/>
+        <w:jc w:val="center"/>
+      </w:pPr>
+      <w:r>
+        <w:drawing>
+          <wp:inline xmlns:a="http://schemas.openxmlformats.org/drawingml/2006/main" xmlns:pic="http://schemas.openxmlformats.org/drawingml/2006/picture">
+            <wp:extent cx="5040000" cy="20927812"/>
+            <wp:docPr id="2" name="Picture 2"/>
+            <wp:cNvGraphicFramePr>
+              <a:graphicFrameLocks noChangeAspect="1"/>
+            </wp:cNvGraphicFramePr>
+            <a:graphic>
+              <a:graphicData uri="http://schemas.openxmlformats.org/drawingml/2006/picture">
+                <pic:pic>
+                  <pic:nvPicPr>
+                    <pic:cNvPr id="0" name="01-landing.png"/>
+                    <pic:cNvPicPr/>
+                  </pic:nvPicPr>
+                  <pic:blipFill>
+                    <a:blip r:embed="rId13"/>
+                    <a:stretch>
+                      <a:fillRect/>
+                    </a:stretch>
+                  </pic:blipFill>
+                  <pic:spPr>
+                    <a:xfrm>
+                      <a:off x="0" y="0"/>
+                      <a:ext cx="5040000" cy="20927812"/>
+                    </a:xfrm>
+                    <a:prstGeom prst="rect"/>
+                  </pic:spPr>
+                </pic:pic>
+              </a:graphicData>
+            </a:graphic>
+          </wp:inline>
+        </w:drawing>
+      </w:r>
+    </w:p>
+    <w:p>
+      <w:pPr>
+        <w:spacing w:before="60" w:after="240"/>
+        <w:jc w:val="center"/>
+      </w:pPr>
+      <w:r>
+        <w:rPr>
+          <w:i/>
+        </w:rPr>
+        <w:t>Figure 4.1: Landing Page of the AgriFlow AI Platform</w:t>
       </w:r>
     </w:p>
     <w:p>
@@ -4955,7 +5232,59 @@
         <w:jc w:val="both"/>
       </w:pPr>
       <w:r>
-        <w:t>The signup and login interfaces allow users to register under one of the five roles and to authenticate, with features such as a password strength meter and secure password generator.</w:t>
+        <w:t>The signup and login interfaces, shown in Figure 4.2, allow users to register under one of the five roles and to authenticate, with features such as a password strength meter and secure password generator.</w:t>
+      </w:r>
+    </w:p>
+    <w:p>
+      <w:pPr>
+        <w:spacing w:before="120" w:after="60"/>
+        <w:jc w:val="center"/>
+      </w:pPr>
+      <w:r>
+        <w:drawing>
+          <wp:inline xmlns:a="http://schemas.openxmlformats.org/drawingml/2006/main" xmlns:pic="http://schemas.openxmlformats.org/drawingml/2006/picture">
+            <wp:extent cx="5040000" cy="3150000"/>
+            <wp:docPr id="3" name="Picture 3"/>
+            <wp:cNvGraphicFramePr>
+              <a:graphicFrameLocks noChangeAspect="1"/>
+            </wp:cNvGraphicFramePr>
+            <a:graphic>
+              <a:graphicData uri="http://schemas.openxmlformats.org/drawingml/2006/picture">
+                <pic:pic>
+                  <pic:nvPicPr>
+                    <pic:cNvPr id="0" name="03-signup.png"/>
+                    <pic:cNvPicPr/>
+                  </pic:nvPicPr>
+                  <pic:blipFill>
+                    <a:blip r:embed="rId14"/>
+                    <a:stretch>
+                      <a:fillRect/>
+                    </a:stretch>
+                  </pic:blipFill>
+                  <pic:spPr>
+                    <a:xfrm>
+                      <a:off x="0" y="0"/>
+                      <a:ext cx="5040000" cy="3150000"/>
+                    </a:xfrm>
+                    <a:prstGeom prst="rect"/>
+                  </pic:spPr>
+                </pic:pic>
+              </a:graphicData>
+            </a:graphic>
+          </wp:inline>
+        </w:drawing>
+      </w:r>
+    </w:p>
+    <w:p>
+      <w:pPr>
+        <w:spacing w:before="60" w:after="240"/>
+        <w:jc w:val="center"/>
+      </w:pPr>
+      <w:r>
+        <w:rPr>
+          <w:i/>
+        </w:rPr>
+        <w:t>Figure 4.2: Signup Interface (left) and Login Interface (right)</w:t>
       </w:r>
     </w:p>
     <w:p>
@@ -4971,7 +5300,59 @@
         <w:jc w:val="both"/>
       </w:pPr>
       <w:r>
-        <w:t>The farmer dashboard and crop management interfaces allow farmers to manage crops, record harvests with pricing and grading, view a harvest calendar, and confirm incoming orders.</w:t>
+        <w:t>The farmer dashboard and crop management interfaces, shown in Figure 4.3, allow farmers to manage crops, record harvests with pricing and grading, view a harvest calendar, and confirm incoming orders.</w:t>
+      </w:r>
+    </w:p>
+    <w:p>
+      <w:pPr>
+        <w:spacing w:before="120" w:after="60"/>
+        <w:jc w:val="center"/>
+      </w:pPr>
+      <w:r>
+        <w:drawing>
+          <wp:inline xmlns:a="http://schemas.openxmlformats.org/drawingml/2006/main" xmlns:pic="http://schemas.openxmlformats.org/drawingml/2006/picture">
+            <wp:extent cx="5040000" cy="3150000"/>
+            <wp:docPr id="4" name="Picture 4"/>
+            <wp:cNvGraphicFramePr>
+              <a:graphicFrameLocks noChangeAspect="1"/>
+            </wp:cNvGraphicFramePr>
+            <a:graphic>
+              <a:graphicData uri="http://schemas.openxmlformats.org/drawingml/2006/picture">
+                <pic:pic>
+                  <pic:nvPicPr>
+                    <pic:cNvPr id="0" name="dash-farmer.png"/>
+                    <pic:cNvPicPr/>
+                  </pic:nvPicPr>
+                  <pic:blipFill>
+                    <a:blip r:embed="rId15"/>
+                    <a:stretch>
+                      <a:fillRect/>
+                    </a:stretch>
+                  </pic:blipFill>
+                  <pic:spPr>
+                    <a:xfrm>
+                      <a:off x="0" y="0"/>
+                      <a:ext cx="5040000" cy="3150000"/>
+                    </a:xfrm>
+                    <a:prstGeom prst="rect"/>
+                  </pic:spPr>
+                </pic:pic>
+              </a:graphicData>
+            </a:graphic>
+          </wp:inline>
+        </w:drawing>
+      </w:r>
+    </w:p>
+    <w:p>
+      <w:pPr>
+        <w:spacing w:before="60" w:after="240"/>
+        <w:jc w:val="center"/>
+      </w:pPr>
+      <w:r>
+        <w:rPr>
+          <w:i/>
+        </w:rPr>
+        <w:t>Figure 4.3: Farmer Dashboard of the AgriFlow AI Platform</w:t>
       </w:r>
     </w:p>
     <w:p>
@@ -4987,7 +5368,59 @@
         <w:jc w:val="both"/>
       </w:pPr>
       <w:r>
-        <w:t>The buyer marketplace and ordering interfaces allow buyers to search available produce, place orders with a delivery location, and track their orders.</w:t>
+        <w:t>The buyer marketplace and ordering interfaces, shown in Figure 4.4, allow buyers to search available produce, place orders with a delivery location, and track their orders.</w:t>
+      </w:r>
+    </w:p>
+    <w:p>
+      <w:pPr>
+        <w:spacing w:before="120" w:after="60"/>
+        <w:jc w:val="center"/>
+      </w:pPr>
+      <w:r>
+        <w:drawing>
+          <wp:inline xmlns:a="http://schemas.openxmlformats.org/drawingml/2006/main" xmlns:pic="http://schemas.openxmlformats.org/drawingml/2006/picture">
+            <wp:extent cx="5040000" cy="3150000"/>
+            <wp:docPr id="5" name="Picture 5"/>
+            <wp:cNvGraphicFramePr>
+              <a:graphicFrameLocks noChangeAspect="1"/>
+            </wp:cNvGraphicFramePr>
+            <a:graphic>
+              <a:graphicData uri="http://schemas.openxmlformats.org/drawingml/2006/picture">
+                <pic:pic>
+                  <pic:nvPicPr>
+                    <pic:cNvPr id="0" name="dash-buyer.png"/>
+                    <pic:cNvPicPr/>
+                  </pic:nvPicPr>
+                  <pic:blipFill>
+                    <a:blip r:embed="rId16"/>
+                    <a:stretch>
+                      <a:fillRect/>
+                    </a:stretch>
+                  </pic:blipFill>
+                  <pic:spPr>
+                    <a:xfrm>
+                      <a:off x="0" y="0"/>
+                      <a:ext cx="5040000" cy="3150000"/>
+                    </a:xfrm>
+                    <a:prstGeom prst="rect"/>
+                  </pic:spPr>
+                </pic:pic>
+              </a:graphicData>
+            </a:graphic>
+          </wp:inline>
+        </w:drawing>
+      </w:r>
+    </w:p>
+    <w:p>
+      <w:pPr>
+        <w:spacing w:before="60" w:after="240"/>
+        <w:jc w:val="center"/>
+      </w:pPr>
+      <w:r>
+        <w:rPr>
+          <w:i/>
+        </w:rPr>
+        <w:t>Figure 4.4: Buyer Marketplace of the AgriFlow AI Platform</w:t>
       </w:r>
     </w:p>
     <w:p>
@@ -5003,7 +5436,59 @@
         <w:jc w:val="both"/>
       </w:pPr>
       <w:r>
-        <w:t>The warehouse inventory interface displays stored items with live shelf-life status, supports stock-in and stock-out operations, and records stock movements.</w:t>
+        <w:t>The warehouse inventory interface, shown in Figure 4.5, displays stored items with live shelf-life status, supports stock-in and stock-out operations, and records stock movements.</w:t>
+      </w:r>
+    </w:p>
+    <w:p>
+      <w:pPr>
+        <w:spacing w:before="120" w:after="60"/>
+        <w:jc w:val="center"/>
+      </w:pPr>
+      <w:r>
+        <w:drawing>
+          <wp:inline xmlns:a="http://schemas.openxmlformats.org/drawingml/2006/main" xmlns:pic="http://schemas.openxmlformats.org/drawingml/2006/picture">
+            <wp:extent cx="5040000" cy="3150000"/>
+            <wp:docPr id="6" name="Picture 6"/>
+            <wp:cNvGraphicFramePr>
+              <a:graphicFrameLocks noChangeAspect="1"/>
+            </wp:cNvGraphicFramePr>
+            <a:graphic>
+              <a:graphicData uri="http://schemas.openxmlformats.org/drawingml/2006/picture">
+                <pic:pic>
+                  <pic:nvPicPr>
+                    <pic:cNvPr id="0" name="warehouse-inventory.png"/>
+                    <pic:cNvPicPr/>
+                  </pic:nvPicPr>
+                  <pic:blipFill>
+                    <a:blip r:embed="rId17"/>
+                    <a:stretch>
+                      <a:fillRect/>
+                    </a:stretch>
+                  </pic:blipFill>
+                  <pic:spPr>
+                    <a:xfrm>
+                      <a:off x="0" y="0"/>
+                      <a:ext cx="5040000" cy="3150000"/>
+                    </a:xfrm>
+                    <a:prstGeom prst="rect"/>
+                  </pic:spPr>
+                </pic:pic>
+              </a:graphicData>
+            </a:graphic>
+          </wp:inline>
+        </w:drawing>
+      </w:r>
+    </w:p>
+    <w:p>
+      <w:pPr>
+        <w:spacing w:before="60" w:after="240"/>
+        <w:jc w:val="center"/>
+      </w:pPr>
+      <w:r>
+        <w:rPr>
+          <w:i/>
+        </w:rPr>
+        <w:t>Figure 4.5: Warehouse Inventory Interface of the AgriFlow AI Platform</w:t>
       </w:r>
     </w:p>
     <w:p>
@@ -5019,7 +5504,59 @@
         <w:jc w:val="both"/>
       </w:pPr>
       <w:r>
-        <w:t>The transporter interfaces present assigned deliveries and allow the transporter to advance each delivery through its workflow, with routes displayed on a Leaflet map.</w:t>
+        <w:t>The transporter interfaces, shown in Figure 4.6, present assigned deliveries and allow the transporter to advance each delivery through its workflow, with routes displayed on a Leaflet map.</w:t>
+      </w:r>
+    </w:p>
+    <w:p>
+      <w:pPr>
+        <w:spacing w:before="120" w:after="60"/>
+        <w:jc w:val="center"/>
+      </w:pPr>
+      <w:r>
+        <w:drawing>
+          <wp:inline xmlns:a="http://schemas.openxmlformats.org/drawingml/2006/main" xmlns:pic="http://schemas.openxmlformats.org/drawingml/2006/picture">
+            <wp:extent cx="5040000" cy="3150000"/>
+            <wp:docPr id="7" name="Picture 7"/>
+            <wp:cNvGraphicFramePr>
+              <a:graphicFrameLocks noChangeAspect="1"/>
+            </wp:cNvGraphicFramePr>
+            <a:graphic>
+              <a:graphicData uri="http://schemas.openxmlformats.org/drawingml/2006/picture">
+                <pic:pic>
+                  <pic:nvPicPr>
+                    <pic:cNvPr id="0" name="dash-transporter.png"/>
+                    <pic:cNvPicPr/>
+                  </pic:nvPicPr>
+                  <pic:blipFill>
+                    <a:blip r:embed="rId18"/>
+                    <a:stretch>
+                      <a:fillRect/>
+                    </a:stretch>
+                  </pic:blipFill>
+                  <pic:spPr>
+                    <a:xfrm>
+                      <a:off x="0" y="0"/>
+                      <a:ext cx="5040000" cy="3150000"/>
+                    </a:xfrm>
+                    <a:prstGeom prst="rect"/>
+                  </pic:spPr>
+                </pic:pic>
+              </a:graphicData>
+            </a:graphic>
+          </wp:inline>
+        </w:drawing>
+      </w:r>
+    </w:p>
+    <w:p>
+      <w:pPr>
+        <w:spacing w:before="60" w:after="240"/>
+        <w:jc w:val="center"/>
+      </w:pPr>
+      <w:r>
+        <w:rPr>
+          <w:i/>
+        </w:rPr>
+        <w:t>Figure 4.6: Transporter Delivery Workflow of the AgriFlow AI Platform</w:t>
       </w:r>
     </w:p>
     <w:p>
@@ -5035,7 +5572,59 @@
         <w:jc w:val="both"/>
       </w:pPr>
       <w:r>
-        <w:t>The administrator interfaces provide user management with role changes, a full order log, platform statistics, analytics reports, and a control to run the scheduling engine.</w:t>
+        <w:t>The administrator interfaces, shown in Figure 4.7, provide user management with role changes, a full order log, platform statistics, analytics reports, and a control to run the scheduling engine.</w:t>
+      </w:r>
+    </w:p>
+    <w:p>
+      <w:pPr>
+        <w:spacing w:before="120" w:after="60"/>
+        <w:jc w:val="center"/>
+      </w:pPr>
+      <w:r>
+        <w:drawing>
+          <wp:inline xmlns:a="http://schemas.openxmlformats.org/drawingml/2006/main" xmlns:pic="http://schemas.openxmlformats.org/drawingml/2006/picture">
+            <wp:extent cx="5040000" cy="3150000"/>
+            <wp:docPr id="8" name="Picture 8"/>
+            <wp:cNvGraphicFramePr>
+              <a:graphicFrameLocks noChangeAspect="1"/>
+            </wp:cNvGraphicFramePr>
+            <a:graphic>
+              <a:graphicData uri="http://schemas.openxmlformats.org/drawingml/2006/picture">
+                <pic:pic>
+                  <pic:nvPicPr>
+                    <pic:cNvPr id="0" name="dash-admin.png"/>
+                    <pic:cNvPicPr/>
+                  </pic:nvPicPr>
+                  <pic:blipFill>
+                    <a:blip r:embed="rId19"/>
+                    <a:stretch>
+                      <a:fillRect/>
+                    </a:stretch>
+                  </pic:blipFill>
+                  <pic:spPr>
+                    <a:xfrm>
+                      <a:off x="0" y="0"/>
+                      <a:ext cx="5040000" cy="3150000"/>
+                    </a:xfrm>
+                    <a:prstGeom prst="rect"/>
+                  </pic:spPr>
+                </pic:pic>
+              </a:graphicData>
+            </a:graphic>
+          </wp:inline>
+        </w:drawing>
+      </w:r>
+    </w:p>
+    <w:p>
+      <w:pPr>
+        <w:spacing w:before="60" w:after="240"/>
+        <w:jc w:val="center"/>
+      </w:pPr>
+      <w:r>
+        <w:rPr>
+          <w:i/>
+        </w:rPr>
+        <w:t>Figure 4.7: Administrator Scheduling Interface of the AgriFlow AI Platform</w:t>
       </w:r>
     </w:p>
     <w:p>
@@ -5051,7 +5640,59 @@
         <w:jc w:val="both"/>
       </w:pPr>
       <w:r>
-        <w:t>The assistant interface allows users to ask questions about their data and receive plain-language explanations grounded in their live profile, orders, inventory, and forecasts.</w:t>
+        <w:t>The assistant interface, shown in Figure 4.8, allows users to ask questions about their data and receive plain-language explanations grounded in their live profile, orders, inventory, and forecasts.</w:t>
+      </w:r>
+    </w:p>
+    <w:p>
+      <w:pPr>
+        <w:spacing w:before="120" w:after="60"/>
+        <w:jc w:val="center"/>
+      </w:pPr>
+      <w:r>
+        <w:drawing>
+          <wp:inline xmlns:a="http://schemas.openxmlformats.org/drawingml/2006/main" xmlns:pic="http://schemas.openxmlformats.org/drawingml/2006/picture">
+            <wp:extent cx="5040000" cy="3150000"/>
+            <wp:docPr id="9" name="Picture 9"/>
+            <wp:cNvGraphicFramePr>
+              <a:graphicFrameLocks noChangeAspect="1"/>
+            </wp:cNvGraphicFramePr>
+            <a:graphic>
+              <a:graphicData uri="http://schemas.openxmlformats.org/drawingml/2006/picture">
+                <pic:pic>
+                  <pic:nvPicPr>
+                    <pic:cNvPr id="0" name="assistant.png"/>
+                    <pic:cNvPicPr/>
+                  </pic:nvPicPr>
+                  <pic:blipFill>
+                    <a:blip r:embed="rId20"/>
+                    <a:stretch>
+                      <a:fillRect/>
+                    </a:stretch>
+                  </pic:blipFill>
+                  <pic:spPr>
+                    <a:xfrm>
+                      <a:off x="0" y="0"/>
+                      <a:ext cx="5040000" cy="3150000"/>
+                    </a:xfrm>
+                    <a:prstGeom prst="rect"/>
+                  </pic:spPr>
+                </pic:pic>
+              </a:graphicData>
+            </a:graphic>
+          </wp:inline>
+        </w:drawing>
+      </w:r>
+    </w:p>
+    <w:p>
+      <w:pPr>
+        <w:spacing w:before="60" w:after="240"/>
+        <w:jc w:val="center"/>
+      </w:pPr>
+      <w:r>
+        <w:rPr>
+          <w:i/>
+        </w:rPr>
+        <w:t>Figure 4.8: AI Assistant Interface of the AgriFlow AI Platform</w:t>
       </w:r>
     </w:p>
     <w:p>

</xml_diff>